<commit_message>
Correct accessibility checklist wording and simplify punctuation
</commit_message>
<xml_diff>
--- a/artifacts/digital-lesson-accessibility-quick-check.docx
+++ b/artifacts/digital-lesson-accessibility-quick-check.docx
@@ -94,7 +94,7 @@
                 <w:color w:val="1F2937"/>
                 <w:sz w:val="20"/>
               </w:rPr>
-              <w:t>Review one existing digital lesson or resource with a colleague, identify one practical improvement, and make learning easier to access. This is a supportive conversation—not an evaluation or compliance score.</w:t>
+              <w:t>Review one existing digital lesson or resource with a colleague, identify one practical improvement, and make learning easier to access. This is a supportive conversation, not an evaluation or compliance score.</w:t>
             </w:r>
           </w:p>
         </w:tc>
@@ -810,7 +810,7 @@
                 <w:color w:val="1F2937"/>
                 <w:sz w:val="17"/>
               </w:rPr>
-              <w:t>Important information appears as selectable text—not only inside an image.</w:t>
+              <w:t>Important information appears as selectable text, not only inside an image.</w:t>
             </w:r>
           </w:p>
         </w:tc>
@@ -1924,7 +1924,7 @@
               <w:spacing w:after="0"/>
             </w:pPr>
             <w:r>
-              <w:t>Effect on the educator: The educator recognized that image-based text can block zoom and read-aloud tools and planned to reuse the check.</w:t>
+              <w:t>Effect on the educator: The educator recognized that image-based text can block text selection and read-aloud tools and planned to reuse the check.</w:t>
             </w:r>
           </w:p>
         </w:tc>
@@ -2068,7 +2068,7 @@
                 <w:color w:val="1F4E78"/>
                 <w:sz w:val="18"/>
               </w:rPr>
-              <w:t>4.1.b — Equitable access</w:t>
+              <w:t>4.1.b: Equitable access</w:t>
             </w:r>
             <w:r>
               <w:rPr>
@@ -2105,7 +2105,7 @@
                 <w:color w:val="1F4E78"/>
                 <w:sz w:val="18"/>
               </w:rPr>
-              <w:t>4.1.c — Supportive coaching culture</w:t>
+              <w:t>4.1.c: Supportive coaching culture</w:t>
             </w:r>
             <w:r>
               <w:rPr>

</xml_diff>